<commit_message>
feat: add adapter-gated audio runtime and reviewable training workflow
- add strict Gemma/Qwen runtime readiness, role-specific adapters, and safe audio controls
- deliver streamed API and dashboard experiences with runtime and training telemetry
- strengthen closed-world tools, judging, redaction, and product safety boundaries
- add audio-first QLoRA/GRPO training, held-out gates, benchmarks, and Modal workflows
- refresh Docker deployment, documentation, walkthroughs, and test coverage
</commit_message>
<xml_diff>
--- a/docs/VishGym_Solution_Walkthrough.docx
+++ b/docs/VishGym_Solution_Walkthrough.docx
@@ -191,7 +191,7 @@
                 <w:color w:val="000000"/>
                 <w:sz w:val="21"/>
               </w:rPr>
-              <w:t>Runnable local scaffold; GPU training integration ready</w:t>
+              <w:t>Runnable prototype; measured Modal benchmark included</w:t>
             </w:r>
           </w:p>
         </w:tc>
@@ -472,7 +472,7 @@
           <w:color w:val="000000"/>
           <w:sz w:val="22"/>
         </w:rPr>
-        <w:t>The environment implements OpenEnv-style reset, step, and state semantics. Each episode creates new fictional personas, pseudo-identifiers, a virtual INR wallet, synthetic inbox records, sandbox-only pages, fixed search results, audio turns, and an immutable tool ledger.</w:t>
+        <w:t>The environment implements OpenEnv-style reset, step, and state semantics. Each episode creates new fictional personas, pseudo-identifiers, a virtual INR wallet, synthetic inbox records, sandbox-only pages, fixed search results, audio turns, and an immutable tool ledger. The web prototype defaults to a fresh random seed, persona pair, pseudo-identity packet, built-in voice, and tone profile for every live call; fixed seeds remain available for reproducible evaluation.</w:t>
       </w:r>
     </w:p>
     <w:p>
@@ -502,7 +502,7 @@
           <w:color w:val="000000"/>
           <w:sz w:val="22"/>
         </w:rPr>
-        <w:t>Conversation is audio-only for the opponent. The hidden transcript is retained solely for audit and the reward judge.</w:t>
+        <w:t>Conversation is audio-only for the opponent. The prototype displays the actual synthetic message spoken by either agent for judge review, but the agents themselves never receive a text transcript.</w:t>
       </w:r>
     </w:p>
     <w:p>
@@ -891,7 +891,7 @@
           <w:color w:val="000000"/>
           <w:sz w:val="22"/>
         </w:rPr>
-        <w:t>Six additional catalogue cards support breadth without claiming unimplemented live flows. All scenario language, identifiers, and pages are fictional and labelled as simulation content.</w:t>
+        <w:t xml:space="preserve"> Six additional catalogue cards support breadth without claiming unimplemented live flows. All scenario language, identifiers, and pages are fictional and labelled as simulation content.</w:t>
       </w:r>
     </w:p>
     <w:p>
@@ -919,7 +919,7 @@
           <w:color w:val="000000"/>
           <w:sz w:val="22"/>
         </w:rPr>
-        <w:t>Rewards are delayed until the terminal episode. Deterministic rules govern virtual payment, pseudo-credential exposure, reporting, blocking, and invalid actions. The judge provides only a small contextual adjustment. Blue is rewarded for correct safe behavior and penalized for unsafe virtual actions or unnecessary blocks. Red receives simulated reward only for sandbox-contained outcomes and loses reward for invalid or boundary-violating actions.</w:t>
+        <w:t>Rewards are delayed until the terminal episode. Deterministic rules govern virtual payment, pseudo-credential exposure, reporting, blocking, and invalid actions. The judge provides only a small contextual adjustment. Blue is rewarded for correct safe behavior and penalized for unsafe virtual actions, unnecessary blocks, and unnecessary declines on legitimate controls; this prevents a degenerate block-everything policy. Red receives simulated reward only for sandbox-contained outcomes and loses reward for invalid or boundary-violating actions.</w:t>
       </w:r>
     </w:p>
     <w:p>
@@ -964,7 +964,7 @@
           <w:color w:val="000000"/>
           <w:sz w:val="22"/>
         </w:rPr>
-        <w:t>Blue update: QLoRA/GRPO against reviewed Red, gated by F1 &gt;= 0.80 and legitimate false-block rate &lt;= 10%.</w:t>
+        <w:t>Blue update: QLoRA/GRPO against reviewed Red, gated by all nine fraud cards, at least two held-out seeds, F1 &gt;= 0.80, legitimate false-block rate &lt;= 10%, valid tool-call rate &gt;= 98%, and zero boundary violations.</w:t>
       </w:r>
     </w:p>
     <w:p>
@@ -1040,7 +1040,431 @@
           <w:color w:val="2E74B5"/>
           <w:sz w:val="32"/>
         </w:rPr>
-        <w:t>8. Evaluation plan</w:t>
+        <w:t>8. Measured Modal benchmark</w:t>
+      </w:r>
+    </w:p>
+    <w:p>
+      <w:pPr>
+        <w:spacing w:before="0" w:after="120" w:line="264" w:lineRule="auto"/>
+      </w:pPr>
+      <w:r>
+        <w:rPr>
+          <w:rFonts w:ascii="Calibri" w:hAnsi="Calibri"/>
+          <w:color w:val="000000"/>
+          <w:sz w:val="22"/>
+        </w:rPr>
+        <w:t>A completed Modal L4 benchmark evaluated two 2-step QLoRA validation adapters against each other using generated Qwen3-TTS CustomVoice audio. It covers all nine synthetic fraud cards plus one legitimate control at held-out seed 101. The system used audio-only opponent input, deterministic generation (temperature 0), and a 96-token action cap. The report stores aggregate metrics only; no raw audio, transcript, or model completion was persisted.</w:t>
+      </w:r>
+    </w:p>
+    <w:tbl>
+      <w:tblPr>
+        <w:tblStyle w:val="TableGrid"/>
+        <w:tblW w:type="dxa" w:w="9360"/>
+        <w:jc w:val="left"/>
+        <w:tblLayout w:type="fixed"/>
+        <w:tblLook w:firstColumn="1" w:firstRow="1" w:lastColumn="0" w:lastRow="0" w:noHBand="0" w:noVBand="1" w:val="04A0"/>
+        <w:tblInd w:w="120" w:type="dxa"/>
+      </w:tblPr>
+      <w:tblGrid>
+        <w:gridCol w:w="2160"/>
+        <w:gridCol w:w="2700"/>
+        <w:gridCol w:w="4680"/>
+      </w:tblGrid>
+      <w:tr>
+        <w:tc>
+          <w:tcPr>
+            <w:tcW w:type="dxa" w:w="2160"/>
+            <w:vAlign w:val="center"/>
+            <w:tcMar>
+              <w:top w:w="80" w:type="dxa"/>
+              <w:start w:w="120" w:type="dxa"/>
+              <w:bottom w:w="80" w:type="dxa"/>
+              <w:end w:w="120" w:type="dxa"/>
+            </w:tcMar>
+            <w:shd w:fill="E8EEF5"/>
+          </w:tcPr>
+          <w:p>
+            <w:pPr>
+              <w:spacing w:before="0" w:after="0" w:line="240" w:lineRule="auto"/>
+            </w:pPr>
+            <w:r>
+              <w:rPr>
+                <w:rFonts w:ascii="Calibri" w:hAnsi="Calibri"/>
+                <w:b/>
+                <w:color w:val="0B2545"/>
+                <w:sz w:val="20"/>
+              </w:rPr>
+              <w:t>Metric</w:t>
+            </w:r>
+          </w:p>
+        </w:tc>
+        <w:tc>
+          <w:tcPr>
+            <w:tcW w:type="dxa" w:w="2700"/>
+            <w:vAlign w:val="center"/>
+            <w:tcMar>
+              <w:top w:w="80" w:type="dxa"/>
+              <w:start w:w="120" w:type="dxa"/>
+              <w:bottom w:w="80" w:type="dxa"/>
+              <w:end w:w="120" w:type="dxa"/>
+            </w:tcMar>
+            <w:shd w:fill="E8EEF5"/>
+          </w:tcPr>
+          <w:p>
+            <w:pPr>
+              <w:spacing w:before="0" w:after="0" w:line="240" w:lineRule="auto"/>
+            </w:pPr>
+            <w:r>
+              <w:rPr>
+                <w:rFonts w:ascii="Calibri" w:hAnsi="Calibri"/>
+                <w:b/>
+                <w:color w:val="0B2545"/>
+                <w:sz w:val="20"/>
+              </w:rPr>
+              <w:t>Observed result</w:t>
+            </w:r>
+          </w:p>
+        </w:tc>
+        <w:tc>
+          <w:tcPr>
+            <w:tcW w:type="dxa" w:w="4680"/>
+            <w:vAlign w:val="center"/>
+            <w:tcMar>
+              <w:top w:w="80" w:type="dxa"/>
+              <w:start w:w="120" w:type="dxa"/>
+              <w:bottom w:w="80" w:type="dxa"/>
+              <w:end w:w="120" w:type="dxa"/>
+            </w:tcMar>
+            <w:shd w:fill="E8EEF5"/>
+          </w:tcPr>
+          <w:p>
+            <w:pPr>
+              <w:spacing w:before="0" w:after="0" w:line="240" w:lineRule="auto"/>
+            </w:pPr>
+            <w:r>
+              <w:rPr>
+                <w:rFonts w:ascii="Calibri" w:hAnsi="Calibri"/>
+                <w:b/>
+                <w:color w:val="0B2545"/>
+                <w:sz w:val="20"/>
+              </w:rPr>
+              <w:t>Interpretation</w:t>
+            </w:r>
+          </w:p>
+        </w:tc>
+      </w:tr>
+      <w:tr>
+        <w:tc>
+          <w:tcPr>
+            <w:tcW w:type="dxa" w:w="2160"/>
+          </w:tcPr>
+          <w:p>
+            <w:pPr>
+              <w:spacing w:before="0" w:after="0" w:line="264" w:lineRule="auto"/>
+            </w:pPr>
+            <w:r>
+              <w:rPr>
+                <w:rFonts w:ascii="Calibri" w:hAnsi="Calibri"/>
+                <w:color w:val="000000"/>
+                <w:sz w:val="21"/>
+              </w:rPr>
+              <w:t>Blue fraud-decision F1</w:t>
+            </w:r>
+          </w:p>
+        </w:tc>
+        <w:tc>
+          <w:tcPr>
+            <w:tcW w:type="dxa" w:w="2700"/>
+          </w:tcPr>
+          <w:p>
+            <w:pPr>
+              <w:spacing w:before="0" w:after="0" w:line="264" w:lineRule="auto"/>
+            </w:pPr>
+            <w:r>
+              <w:rPr>
+                <w:rFonts w:ascii="Calibri" w:hAnsi="Calibri"/>
+                <w:color w:val="000000"/>
+                <w:sz w:val="21"/>
+              </w:rPr>
+              <w:t>0.9474 (9/9 fraud cases safely defended)</w:t>
+            </w:r>
+          </w:p>
+        </w:tc>
+        <w:tc>
+          <w:tcPr>
+            <w:tcW w:type="dxa" w:w="4680"/>
+          </w:tcPr>
+          <w:p>
+            <w:pPr>
+              <w:spacing w:before="0" w:after="0" w:line="264" w:lineRule="auto"/>
+            </w:pPr>
+            <w:r>
+              <w:rPr>
+                <w:rFonts w:ascii="Calibri" w:hAnsi="Calibri"/>
+                <w:color w:val="000000"/>
+                <w:sz w:val="21"/>
+              </w:rPr>
+              <w:t>Strong fraud-card coverage in this one-seed validation run.</w:t>
+            </w:r>
+          </w:p>
+        </w:tc>
+      </w:tr>
+      <w:tr>
+        <w:tc>
+          <w:tcPr>
+            <w:tcW w:type="dxa" w:w="2160"/>
+          </w:tcPr>
+          <w:p>
+            <w:pPr>
+              <w:spacing w:before="0" w:after="0" w:line="264" w:lineRule="auto"/>
+            </w:pPr>
+            <w:r>
+              <w:rPr>
+                <w:rFonts w:ascii="Calibri" w:hAnsi="Calibri"/>
+                <w:color w:val="000000"/>
+                <w:sz w:val="21"/>
+              </w:rPr>
+              <w:t>Legitimate false-block rate</w:t>
+            </w:r>
+          </w:p>
+        </w:tc>
+        <w:tc>
+          <w:tcPr>
+            <w:tcW w:type="dxa" w:w="2700"/>
+          </w:tcPr>
+          <w:p>
+            <w:pPr>
+              <w:spacing w:before="0" w:after="0" w:line="264" w:lineRule="auto"/>
+            </w:pPr>
+            <w:r>
+              <w:rPr>
+                <w:rFonts w:ascii="Calibri" w:hAnsi="Calibri"/>
+                <w:color w:val="000000"/>
+                <w:sz w:val="21"/>
+              </w:rPr>
+              <w:t>100% (1/1 control blocked)</w:t>
+            </w:r>
+          </w:p>
+        </w:tc>
+        <w:tc>
+          <w:tcPr>
+            <w:tcW w:type="dxa" w:w="4680"/>
+          </w:tcPr>
+          <w:p>
+            <w:pPr>
+              <w:spacing w:before="0" w:after="0" w:line="264" w:lineRule="auto"/>
+            </w:pPr>
+            <w:r>
+              <w:rPr>
+                <w:rFonts w:ascii="Calibri" w:hAnsi="Calibri"/>
+                <w:color w:val="000000"/>
+                <w:sz w:val="21"/>
+              </w:rPr>
+              <w:t>Fails the &lt;=10% gate; adapter is not eligible for promotion.</w:t>
+            </w:r>
+          </w:p>
+        </w:tc>
+      </w:tr>
+      <w:tr>
+        <w:tc>
+          <w:tcPr>
+            <w:tcW w:type="dxa" w:w="2160"/>
+          </w:tcPr>
+          <w:p>
+            <w:pPr>
+              <w:spacing w:before="0" w:after="0" w:line="264" w:lineRule="auto"/>
+            </w:pPr>
+            <w:r>
+              <w:rPr>
+                <w:rFonts w:ascii="Calibri" w:hAnsi="Calibri"/>
+                <w:color w:val="000000"/>
+                <w:sz w:val="21"/>
+              </w:rPr>
+              <w:t>Blue valid tool-call rate</w:t>
+            </w:r>
+          </w:p>
+        </w:tc>
+        <w:tc>
+          <w:tcPr>
+            <w:tcW w:type="dxa" w:w="2700"/>
+          </w:tcPr>
+          <w:p>
+            <w:pPr>
+              <w:spacing w:before="0" w:after="0" w:line="264" w:lineRule="auto"/>
+            </w:pPr>
+            <w:r>
+              <w:rPr>
+                <w:rFonts w:ascii="Calibri" w:hAnsi="Calibri"/>
+                <w:color w:val="000000"/>
+                <w:sz w:val="21"/>
+              </w:rPr>
+              <w:t>100% (60/60)</w:t>
+            </w:r>
+          </w:p>
+        </w:tc>
+        <w:tc>
+          <w:tcPr>
+            <w:tcW w:type="dxa" w:w="4680"/>
+          </w:tcPr>
+          <w:p>
+            <w:pPr>
+              <w:spacing w:before="0" w:after="0" w:line="264" w:lineRule="auto"/>
+            </w:pPr>
+            <w:r>
+              <w:rPr>
+                <w:rFonts w:ascii="Calibri" w:hAnsi="Calibri"/>
+                <w:color w:val="000000"/>
+                <w:sz w:val="21"/>
+              </w:rPr>
+              <w:t>No malformed or boundary-violating tool action was observed.</w:t>
+            </w:r>
+          </w:p>
+        </w:tc>
+      </w:tr>
+      <w:tr>
+        <w:tc>
+          <w:tcPr>
+            <w:tcW w:type="dxa" w:w="2160"/>
+          </w:tcPr>
+          <w:p>
+            <w:pPr>
+              <w:spacing w:before="0" w:after="0" w:line="264" w:lineRule="auto"/>
+            </w:pPr>
+            <w:r>
+              <w:rPr>
+                <w:rFonts w:ascii="Calibri" w:hAnsi="Calibri"/>
+                <w:color w:val="000000"/>
+                <w:sz w:val="21"/>
+              </w:rPr>
+              <w:t>Red simulated attack success</w:t>
+            </w:r>
+          </w:p>
+        </w:tc>
+        <w:tc>
+          <w:tcPr>
+            <w:tcW w:type="dxa" w:w="2700"/>
+          </w:tcPr>
+          <w:p>
+            <w:pPr>
+              <w:spacing w:before="0" w:after="0" w:line="264" w:lineRule="auto"/>
+            </w:pPr>
+            <w:r>
+              <w:rPr>
+                <w:rFonts w:ascii="Calibri" w:hAnsi="Calibri"/>
+                <w:color w:val="000000"/>
+                <w:sz w:val="21"/>
+              </w:rPr>
+              <w:t>0% (0/9)</w:t>
+            </w:r>
+          </w:p>
+        </w:tc>
+        <w:tc>
+          <w:tcPr>
+            <w:tcW w:type="dxa" w:w="4680"/>
+          </w:tcPr>
+          <w:p>
+            <w:pPr>
+              <w:spacing w:before="0" w:after="0" w:line="264" w:lineRule="auto"/>
+            </w:pPr>
+            <w:r>
+              <w:rPr>
+                <w:rFonts w:ascii="Calibri" w:hAnsi="Calibri"/>
+                <w:color w:val="000000"/>
+                <w:sz w:val="21"/>
+              </w:rPr>
+              <w:t>The validation attacker did not obtain a simulated compromise.</w:t>
+            </w:r>
+          </w:p>
+        </w:tc>
+      </w:tr>
+      <w:tr>
+        <w:tc>
+          <w:tcPr>
+            <w:tcW w:type="dxa" w:w="2160"/>
+          </w:tcPr>
+          <w:p>
+            <w:pPr>
+              <w:spacing w:before="0" w:after="0" w:line="264" w:lineRule="auto"/>
+            </w:pPr>
+            <w:r>
+              <w:rPr>
+                <w:rFonts w:ascii="Calibri" w:hAnsi="Calibri"/>
+                <w:color w:val="000000"/>
+                <w:sz w:val="21"/>
+              </w:rPr>
+              <w:t>Red valid tool-call rate</w:t>
+            </w:r>
+          </w:p>
+        </w:tc>
+        <w:tc>
+          <w:tcPr>
+            <w:tcW w:type="dxa" w:w="2700"/>
+          </w:tcPr>
+          <w:p>
+            <w:pPr>
+              <w:spacing w:before="0" w:after="0" w:line="264" w:lineRule="auto"/>
+            </w:pPr>
+            <w:r>
+              <w:rPr>
+                <w:rFonts w:ascii="Calibri" w:hAnsi="Calibri"/>
+                <w:color w:val="000000"/>
+                <w:sz w:val="21"/>
+              </w:rPr>
+              <w:t>100% (54 calls)</w:t>
+            </w:r>
+          </w:p>
+        </w:tc>
+        <w:tc>
+          <w:tcPr>
+            <w:tcW w:type="dxa" w:w="4680"/>
+          </w:tcPr>
+          <w:p>
+            <w:pPr>
+              <w:spacing w:before="0" w:after="0" w:line="264" w:lineRule="auto"/>
+            </w:pPr>
+            <w:r>
+              <w:rPr>
+                <w:rFonts w:ascii="Calibri" w:hAnsi="Calibri"/>
+                <w:color w:val="000000"/>
+                <w:sz w:val="21"/>
+              </w:rPr>
+              <w:t>All attacker tool use remained inside the sandbox.</w:t>
+            </w:r>
+          </w:p>
+        </w:tc>
+      </w:tr>
+    </w:tbl>
+    <w:p>
+      <w:pPr>
+        <w:spacing w:after="40"/>
+      </w:pPr>
+    </w:p>
+    <w:p>
+      <w:pPr>
+        <w:spacing w:before="0" w:after="120" w:line="264" w:lineRule="auto"/>
+      </w:pPr>
+      <w:r>
+        <w:rPr>
+          <w:rFonts w:ascii="Calibri" w:hAnsi="Calibri"/>
+          <w:color w:val="000000"/>
+          <w:sz w:val="22"/>
+        </w:rPr>
+        <w:t>This is a reproducible pipeline benchmark, not a deployment-efficacy claim: it uses one held-out seed and undertrained adapters. The red/blue review manifests remain review_required. The next gate is a larger, multi-seed run (101 and 103), all nine fraud cards, held-out personas/timbres, legitimate controls, and human review; only then can the planned F1, false-block, validity, and boundary thresholds be assessed.</w:t>
+      </w:r>
+    </w:p>
+    <w:p>
+      <w:pPr>
+        <w:pStyle w:val="Heading1"/>
+        <w:spacing w:before="320" w:after="160" w:line="264" w:lineRule="auto"/>
+      </w:pPr>
+      <w:r>
+        <w:rPr>
+          <w:rFonts w:ascii="Calibri" w:hAnsi="Calibri"/>
+          <w:b/>
+          <w:color w:val="2E74B5"/>
+          <w:sz w:val="32"/>
+        </w:rPr>
+        <w:t>9. Evaluation plan</w:t>
       </w:r>
     </w:p>
     <w:p>
@@ -1100,6 +1524,21 @@
           <w:color w:val="000000"/>
           <w:sz w:val="22"/>
         </w:rPr>
+        <w:t>Reject narrow runs before review unless they cover all nine fraud attack cards across at least two held-out seeds.</w:t>
+      </w:r>
+    </w:p>
+    <w:p>
+      <w:pPr>
+        <w:pStyle w:val="ListBullet"/>
+        <w:spacing w:before="0" w:after="80" w:line="280" w:lineRule="auto"/>
+        <w:ind w:left="461" w:hanging="259"/>
+      </w:pPr>
+      <w:r>
+        <w:rPr>
+          <w:rFonts w:ascii="Calibri" w:hAnsi="Calibri"/>
+          <w:color w:val="000000"/>
+          <w:sz w:val="22"/>
+        </w:rPr>
         <w:t>Run integration checks for invalid tool calls, non-sandbox URL attempts, inference timeouts, audio failures, and expired simulation records.</w:t>
       </w:r>
     </w:p>
@@ -1115,7 +1554,7 @@
           <w:color w:val="2E74B5"/>
           <w:sz w:val="32"/>
         </w:rPr>
-        <w:t>9. Real-world feasibility and safeguards</w:t>
+        <w:t>10. Real-world feasibility and safeguards</w:t>
       </w:r>
     </w:p>
     <w:p>
@@ -1156,7 +1595,7 @@
           <w:color w:val="2E74B5"/>
           <w:sz w:val="32"/>
         </w:rPr>
-        <w:t>10. Submission artifacts</w:t>
+        <w:t>11. Submission artifacts</w:t>
       </w:r>
     </w:p>
     <w:p>
@@ -1201,7 +1640,7 @@
           <w:color w:val="000000"/>
           <w:sz w:val="22"/>
         </w:rPr>
-        <w:t>Hosted Hugging Face Docker Space using approved GPU access and private deployment secrets.</w:t>
+        <w:t>Hugging Face Docker Space configuration ready for deployment; no public hosted Space is claimed until it is deployed and reviewed.</w:t>
       </w:r>
     </w:p>
     <w:sectPr>

</xml_diff>